<commit_message>
Update AWS Developer Associate courseware
</commit_message>
<xml_diff>
--- a/courseware/LG-AWS Certified Developer Associate Training.docx
+++ b/courseware/LG-AWS Certified Developer Associate Training.docx
@@ -188,7 +188,7 @@
           <w:color w:val="4B5563"/>
           <w:sz w:val="20"/>
         </w:rPr>
-        <w:t>Version 2</w:t>
+        <w:t>Version 3</w:t>
       </w:r>
     </w:p>
     <w:p>
@@ -288,7 +288,7 @@
           </w:tcPr>
           <w:p>
             <w:r>
-              <w:t>2</w:t>
+              <w:t>3</w:t>
             </w:r>
           </w:p>
         </w:tc>
@@ -298,7 +298,7 @@
           </w:tcPr>
           <w:p>
             <w:r>
-              <w:t>10 July 2026</w:t>
+              <w:t>13 July 2026</w:t>
             </w:r>
           </w:p>
         </w:tc>
@@ -308,7 +308,7 @@
           </w:tcPr>
           <w:p>
             <w:r>
-              <w:t>Added lab architecture visuals, reference-aligned admin slides, and AWS practice exam guidance.</w:t>
+              <w:t>Regenerated courseware with updated LMS download guidance, AWS practice exam link, and assessment alignment.</w:t>
             </w:r>
           </w:p>
         </w:tc>

</xml_diff>